<commit_message>
Arbeitsblätter 1–24 mit passenden Otter-Illustrationen ergänzen
</commit_message>
<xml_diff>
--- a/materialien/arbeitsblaetter/Arbeitsblaetter_1-24_DIN_A5_ueberarbeitet.docx
+++ b/materialien/arbeitsblaetter/Arbeitsblaetter_1-24_DIN_A5_ueberarbeitet.docx
@@ -6,6 +6,7 @@
       <w:pPr>
         <w:pageBreakBefore w:val="0"/>
         <w:spacing w:after="60"/>
+        <w:ind w:right="1701"/>
       </w:pPr>
       <w:r>
         <w:rPr>
@@ -14,8 +15,54 @@
         </w:rPr>
         <w:t>Blatt 1</w:t>
       </w:r>
-    </w:p>
-    <w:p>
+      <w:r>
+        <w:drawing>
+          <wp:anchor distT="0" distB="0" distL="0" distR="0" simplePos="0" relativeHeight="0" behindDoc="0" locked="0" layoutInCell="1" allowOverlap="0">
+            <wp:simplePos x="0" y="0"/>
+            <wp:positionH relativeFrom="column">
+              <wp:align>right</wp:align>
+            </wp:positionH>
+            <wp:positionV relativeFrom="paragraph">
+              <wp:posOffset>0</wp:posOffset>
+            </wp:positionV>
+            <wp:extent cx="594184" cy="558000"/>
+            <wp:wrapNone/>
+            <wp:docPr id="1" name="Picture 1" descr="Otter denkt nach"/>
+            <wp:cNvGraphicFramePr xmlns:a="http://schemas.openxmlformats.org/drawingml/2006/main">
+              <a:graphicFrameLocks noChangeAspect="1"/>
+            </wp:cNvGraphicFramePr>
+            <a:graphic xmlns:a="http://schemas.openxmlformats.org/drawingml/2006/main" xmlns:pic="http://schemas.openxmlformats.org/drawingml/2006/picture">
+              <a:graphicData uri="http://schemas.openxmlformats.org/drawingml/2006/picture">
+                <pic:pic>
+                  <pic:nvPicPr>
+                    <pic:cNvPr id="0" name="Collage Otterbilder Briefe.png"/>
+                    <pic:cNvPicPr/>
+                  </pic:nvPicPr>
+                  <pic:blipFill>
+                    <a:blip r:embed="rId9"/>
+                    <a:srcRect l="36800" t="31000" r="39800" b="39700"/>
+                    <a:stretch>
+                      <a:fillRect/>
+                    </a:stretch>
+                  </pic:blipFill>
+                  <pic:spPr>
+                    <a:xfrm>
+                      <a:off x="0" y="0"/>
+                      <a:ext cx="594184" cy="558000"/>
+                    </a:xfrm>
+                    <a:prstGeom prst="rect"/>
+                  </pic:spPr>
+                </pic:pic>
+              </a:graphicData>
+            </a:graphic>
+          </wp:anchor>
+        </w:drawing>
+      </w:r>
+    </w:p>
+    <w:p>
+      <w:pPr>
+        <w:ind w:right="1701"/>
+      </w:pPr>
       <w:r>
         <w:rPr>
           <w:b/>
@@ -183,6 +230,7 @@
       <w:pPr>
         <w:pageBreakBefore/>
         <w:spacing w:after="60"/>
+        <w:ind w:right="1701"/>
       </w:pPr>
       <w:r>
         <w:rPr>
@@ -191,8 +239,54 @@
         </w:rPr>
         <w:t>Blatt 2</w:t>
       </w:r>
-    </w:p>
-    <w:p>
+      <w:r>
+        <w:drawing>
+          <wp:anchor distT="0" distB="0" distL="0" distR="0" simplePos="0" relativeHeight="0" behindDoc="0" locked="0" layoutInCell="1" allowOverlap="0">
+            <wp:simplePos x="0" y="0"/>
+            <wp:positionH relativeFrom="column">
+              <wp:align>right</wp:align>
+            </wp:positionH>
+            <wp:positionV relativeFrom="paragraph">
+              <wp:posOffset>0</wp:posOffset>
+            </wp:positionV>
+            <wp:extent cx="594184" cy="558000"/>
+            <wp:wrapNone/>
+            <wp:docPr id="2" name="Picture 2" descr="Otter denkt nach"/>
+            <wp:cNvGraphicFramePr xmlns:a="http://schemas.openxmlformats.org/drawingml/2006/main">
+              <a:graphicFrameLocks noChangeAspect="1"/>
+            </wp:cNvGraphicFramePr>
+            <a:graphic xmlns:a="http://schemas.openxmlformats.org/drawingml/2006/main" xmlns:pic="http://schemas.openxmlformats.org/drawingml/2006/picture">
+              <a:graphicData uri="http://schemas.openxmlformats.org/drawingml/2006/picture">
+                <pic:pic>
+                  <pic:nvPicPr>
+                    <pic:cNvPr id="0" name="Collage Otterbilder Briefe.png"/>
+                    <pic:cNvPicPr/>
+                  </pic:nvPicPr>
+                  <pic:blipFill>
+                    <a:blip r:embed="rId9"/>
+                    <a:srcRect l="36800" t="31000" r="39800" b="39700"/>
+                    <a:stretch>
+                      <a:fillRect/>
+                    </a:stretch>
+                  </pic:blipFill>
+                  <pic:spPr>
+                    <a:xfrm>
+                      <a:off x="0" y="0"/>
+                      <a:ext cx="594184" cy="558000"/>
+                    </a:xfrm>
+                    <a:prstGeom prst="rect"/>
+                  </pic:spPr>
+                </pic:pic>
+              </a:graphicData>
+            </a:graphic>
+          </wp:anchor>
+        </w:drawing>
+      </w:r>
+    </w:p>
+    <w:p>
+      <w:pPr>
+        <w:ind w:right="1701"/>
+      </w:pPr>
       <w:r>
         <w:rPr>
           <w:b/>
@@ -367,6 +461,7 @@
       <w:pPr>
         <w:pageBreakBefore/>
         <w:spacing w:after="60"/>
+        <w:ind w:right="1701"/>
       </w:pPr>
       <w:r>
         <w:rPr>
@@ -375,8 +470,54 @@
         </w:rPr>
         <w:t>Blatt 3</w:t>
       </w:r>
-    </w:p>
-    <w:p>
+      <w:r>
+        <w:drawing>
+          <wp:anchor distT="0" distB="0" distL="0" distR="0" simplePos="0" relativeHeight="0" behindDoc="0" locked="0" layoutInCell="1" allowOverlap="0">
+            <wp:simplePos x="0" y="0"/>
+            <wp:positionH relativeFrom="column">
+              <wp:align>right</wp:align>
+            </wp:positionH>
+            <wp:positionV relativeFrom="paragraph">
+              <wp:posOffset>0</wp:posOffset>
+            </wp:positionV>
+            <wp:extent cx="594184" cy="558000"/>
+            <wp:wrapNone/>
+            <wp:docPr id="3" name="Picture 3" descr="Otter denkt nach"/>
+            <wp:cNvGraphicFramePr xmlns:a="http://schemas.openxmlformats.org/drawingml/2006/main">
+              <a:graphicFrameLocks noChangeAspect="1"/>
+            </wp:cNvGraphicFramePr>
+            <a:graphic xmlns:a="http://schemas.openxmlformats.org/drawingml/2006/main" xmlns:pic="http://schemas.openxmlformats.org/drawingml/2006/picture">
+              <a:graphicData uri="http://schemas.openxmlformats.org/drawingml/2006/picture">
+                <pic:pic>
+                  <pic:nvPicPr>
+                    <pic:cNvPr id="0" name="Collage Otterbilder Briefe.png"/>
+                    <pic:cNvPicPr/>
+                  </pic:nvPicPr>
+                  <pic:blipFill>
+                    <a:blip r:embed="rId9"/>
+                    <a:srcRect l="36800" t="31000" r="39800" b="39700"/>
+                    <a:stretch>
+                      <a:fillRect/>
+                    </a:stretch>
+                  </pic:blipFill>
+                  <pic:spPr>
+                    <a:xfrm>
+                      <a:off x="0" y="0"/>
+                      <a:ext cx="594184" cy="558000"/>
+                    </a:xfrm>
+                    <a:prstGeom prst="rect"/>
+                  </pic:spPr>
+                </pic:pic>
+              </a:graphicData>
+            </a:graphic>
+          </wp:anchor>
+        </w:drawing>
+      </w:r>
+    </w:p>
+    <w:p>
+      <w:pPr>
+        <w:ind w:right="1701"/>
+      </w:pPr>
       <w:r>
         <w:rPr>
           <w:b/>
@@ -511,6 +652,7 @@
       <w:pPr>
         <w:pageBreakBefore/>
         <w:spacing w:after="60"/>
+        <w:ind w:right="1701"/>
       </w:pPr>
       <w:r>
         <w:rPr>
@@ -519,8 +661,54 @@
         </w:rPr>
         <w:t>Blatt 4</w:t>
       </w:r>
-    </w:p>
-    <w:p>
+      <w:r>
+        <w:drawing>
+          <wp:anchor distT="0" distB="0" distL="0" distR="0" simplePos="0" relativeHeight="0" behindDoc="0" locked="0" layoutInCell="1" allowOverlap="0">
+            <wp:simplePos x="0" y="0"/>
+            <wp:positionH relativeFrom="column">
+              <wp:align>right</wp:align>
+            </wp:positionH>
+            <wp:positionV relativeFrom="paragraph">
+              <wp:posOffset>0</wp:posOffset>
+            </wp:positionV>
+            <wp:extent cx="720154" cy="558000"/>
+            <wp:wrapNone/>
+            <wp:docPr id="4" name="Picture 4" descr="Otter bringt einen Brief"/>
+            <wp:cNvGraphicFramePr xmlns:a="http://schemas.openxmlformats.org/drawingml/2006/main">
+              <a:graphicFrameLocks noChangeAspect="1"/>
+            </wp:cNvGraphicFramePr>
+            <a:graphic xmlns:a="http://schemas.openxmlformats.org/drawingml/2006/main" xmlns:pic="http://schemas.openxmlformats.org/drawingml/2006/picture">
+              <a:graphicData uri="http://schemas.openxmlformats.org/drawingml/2006/picture">
+                <pic:pic>
+                  <pic:nvPicPr>
+                    <pic:cNvPr id="0" name="Collage Otterbilder Briefe.png"/>
+                    <pic:cNvPicPr/>
+                  </pic:nvPicPr>
+                  <pic:blipFill>
+                    <a:blip r:embed="rId9"/>
+                    <a:srcRect l="2900" t="900" r="66900" b="67900"/>
+                    <a:stretch>
+                      <a:fillRect/>
+                    </a:stretch>
+                  </pic:blipFill>
+                  <pic:spPr>
+                    <a:xfrm>
+                      <a:off x="0" y="0"/>
+                      <a:ext cx="720154" cy="558000"/>
+                    </a:xfrm>
+                    <a:prstGeom prst="rect"/>
+                  </pic:spPr>
+                </pic:pic>
+              </a:graphicData>
+            </a:graphic>
+          </wp:anchor>
+        </w:drawing>
+      </w:r>
+    </w:p>
+    <w:p>
+      <w:pPr>
+        <w:ind w:right="1701"/>
+      </w:pPr>
       <w:r>
         <w:rPr>
           <w:b/>
@@ -679,6 +867,7 @@
       <w:pPr>
         <w:pageBreakBefore/>
         <w:spacing w:after="60"/>
+        <w:ind w:right="1701"/>
       </w:pPr>
       <w:r>
         <w:rPr>
@@ -687,8 +876,54 @@
         </w:rPr>
         <w:t>Blatt 5</w:t>
       </w:r>
-    </w:p>
-    <w:p>
+      <w:r>
+        <w:drawing>
+          <wp:anchor distT="0" distB="0" distL="0" distR="0" simplePos="0" relativeHeight="0" behindDoc="0" locked="0" layoutInCell="1" allowOverlap="0">
+            <wp:simplePos x="0" y="0"/>
+            <wp:positionH relativeFrom="column">
+              <wp:align>right</wp:align>
+            </wp:positionH>
+            <wp:positionV relativeFrom="paragraph">
+              <wp:posOffset>0</wp:posOffset>
+            </wp:positionV>
+            <wp:extent cx="720154" cy="558000"/>
+            <wp:wrapNone/>
+            <wp:docPr id="5" name="Picture 5" descr="Otter bringt einen Brief"/>
+            <wp:cNvGraphicFramePr xmlns:a="http://schemas.openxmlformats.org/drawingml/2006/main">
+              <a:graphicFrameLocks noChangeAspect="1"/>
+            </wp:cNvGraphicFramePr>
+            <a:graphic xmlns:a="http://schemas.openxmlformats.org/drawingml/2006/main" xmlns:pic="http://schemas.openxmlformats.org/drawingml/2006/picture">
+              <a:graphicData uri="http://schemas.openxmlformats.org/drawingml/2006/picture">
+                <pic:pic>
+                  <pic:nvPicPr>
+                    <pic:cNvPr id="0" name="Collage Otterbilder Briefe.png"/>
+                    <pic:cNvPicPr/>
+                  </pic:nvPicPr>
+                  <pic:blipFill>
+                    <a:blip r:embed="rId9"/>
+                    <a:srcRect l="2900" t="900" r="66900" b="67900"/>
+                    <a:stretch>
+                      <a:fillRect/>
+                    </a:stretch>
+                  </pic:blipFill>
+                  <pic:spPr>
+                    <a:xfrm>
+                      <a:off x="0" y="0"/>
+                      <a:ext cx="720154" cy="558000"/>
+                    </a:xfrm>
+                    <a:prstGeom prst="rect"/>
+                  </pic:spPr>
+                </pic:pic>
+              </a:graphicData>
+            </a:graphic>
+          </wp:anchor>
+        </w:drawing>
+      </w:r>
+    </w:p>
+    <w:p>
+      <w:pPr>
+        <w:ind w:right="1701"/>
+      </w:pPr>
       <w:r>
         <w:rPr>
           <w:b/>
@@ -821,6 +1056,7 @@
       <w:pPr>
         <w:pageBreakBefore/>
         <w:spacing w:after="60"/>
+        <w:ind w:right="1701"/>
       </w:pPr>
       <w:r>
         <w:rPr>
@@ -829,8 +1065,83 @@
         </w:rPr>
         <w:t>Blatt 6</w:t>
       </w:r>
-    </w:p>
-    <w:p>
+      <w:r>
+        <w:drawing>
+          <wp:anchor distT="0" distB="0" distL="0" distR="0" simplePos="0" relativeHeight="0" behindDoc="0" locked="0" layoutInCell="1" allowOverlap="0">
+            <wp:simplePos x="0" y="0"/>
+            <wp:positionH relativeFrom="column">
+              <wp:align>right</wp:align>
+            </wp:positionH>
+            <wp:positionV relativeFrom="paragraph">
+              <wp:posOffset>0</wp:posOffset>
+            </wp:positionV>
+            <wp:extent cx="663765" cy="558000"/>
+            <wp:wrapNone/>
+            <wp:docPr id="6" name="Picture 6" descr="Otter liest einen Brief"/>
+            <wp:cNvGraphicFramePr xmlns:a="http://schemas.openxmlformats.org/drawingml/2006/main">
+              <a:graphicFrameLocks noChangeAspect="1"/>
+            </wp:cNvGraphicFramePr>
+            <a:graphic xmlns:a="http://schemas.openxmlformats.org/drawingml/2006/main" xmlns:pic="http://schemas.openxmlformats.org/drawingml/2006/picture">
+              <a:graphicData uri="http://schemas.openxmlformats.org/drawingml/2006/picture">
+                <pic:pic>
+                  <pic:nvPicPr>
+                    <pic:cNvPr id="0" name="Collage Otterbilder Briefe.png"/>
+                    <pic:cNvPicPr/>
+                  </pic:nvPicPr>
+                  <pic:blipFill>
+                    <a:blip r:embed="rId9"/>
+                    <a:srcRect l="5500" t="33500" r="67200" b="35900"/>
+                    <a:stretch>
+                      <a:fillRect/>
+                    </a:stretch>
+                  </pic:blipFill>
+                  <pic:spPr>
+                    <a:xfrm>
+                      <a:off x="0" y="0"/>
+                      <a:ext cx="663765" cy="558000"/>
+                    </a:xfrm>
+                    <a:custGeom>
+                      <a:avLst/>
+                      <a:gdLst/>
+                      <a:ahLst/>
+                      <a:cxnLst/>
+                      <a:rect l="0" t="0" r="r" b="b"/>
+                      <a:pathLst>
+                        <a:path w="100000" h="100000">
+                          <a:moveTo>
+                            <a:pt x="0" y="0"/>
+                          </a:moveTo>
+                          <a:lnTo>
+                            <a:pt x="100000" y="0"/>
+                          </a:lnTo>
+                          <a:lnTo>
+                            <a:pt x="100000" y="94500"/>
+                          </a:lnTo>
+                          <a:lnTo>
+                            <a:pt x="44000" y="94500"/>
+                          </a:lnTo>
+                          <a:lnTo>
+                            <a:pt x="44000" y="100000"/>
+                          </a:lnTo>
+                          <a:lnTo>
+                            <a:pt x="0" y="100000"/>
+                          </a:lnTo>
+                          <a:close/>
+                        </a:path>
+                      </a:pathLst>
+                    </a:custGeom>
+                  </pic:spPr>
+                </pic:pic>
+              </a:graphicData>
+            </a:graphic>
+          </wp:anchor>
+        </w:drawing>
+      </w:r>
+    </w:p>
+    <w:p>
+      <w:pPr>
+        <w:ind w:right="1701"/>
+      </w:pPr>
       <w:r>
         <w:rPr>
           <w:b/>
@@ -965,6 +1276,7 @@
       <w:pPr>
         <w:pageBreakBefore/>
         <w:spacing w:after="60"/>
+        <w:ind w:right="1701"/>
       </w:pPr>
       <w:r>
         <w:rPr>
@@ -973,8 +1285,83 @@
         </w:rPr>
         <w:t>Blatt 7</w:t>
       </w:r>
-    </w:p>
-    <w:p>
+      <w:r>
+        <w:drawing>
+          <wp:anchor distT="0" distB="0" distL="0" distR="0" simplePos="0" relativeHeight="0" behindDoc="0" locked="0" layoutInCell="1" allowOverlap="0">
+            <wp:simplePos x="0" y="0"/>
+            <wp:positionH relativeFrom="column">
+              <wp:align>right</wp:align>
+            </wp:positionH>
+            <wp:positionV relativeFrom="paragraph">
+              <wp:posOffset>0</wp:posOffset>
+            </wp:positionV>
+            <wp:extent cx="663765" cy="558000"/>
+            <wp:wrapNone/>
+            <wp:docPr id="7" name="Picture 7" descr="Otter liest einen Brief"/>
+            <wp:cNvGraphicFramePr xmlns:a="http://schemas.openxmlformats.org/drawingml/2006/main">
+              <a:graphicFrameLocks noChangeAspect="1"/>
+            </wp:cNvGraphicFramePr>
+            <a:graphic xmlns:a="http://schemas.openxmlformats.org/drawingml/2006/main" xmlns:pic="http://schemas.openxmlformats.org/drawingml/2006/picture">
+              <a:graphicData uri="http://schemas.openxmlformats.org/drawingml/2006/picture">
+                <pic:pic>
+                  <pic:nvPicPr>
+                    <pic:cNvPr id="0" name="Collage Otterbilder Briefe.png"/>
+                    <pic:cNvPicPr/>
+                  </pic:nvPicPr>
+                  <pic:blipFill>
+                    <a:blip r:embed="rId9"/>
+                    <a:srcRect l="5500" t="33500" r="67200" b="35900"/>
+                    <a:stretch>
+                      <a:fillRect/>
+                    </a:stretch>
+                  </pic:blipFill>
+                  <pic:spPr>
+                    <a:xfrm>
+                      <a:off x="0" y="0"/>
+                      <a:ext cx="663765" cy="558000"/>
+                    </a:xfrm>
+                    <a:custGeom>
+                      <a:avLst/>
+                      <a:gdLst/>
+                      <a:ahLst/>
+                      <a:cxnLst/>
+                      <a:rect l="0" t="0" r="r" b="b"/>
+                      <a:pathLst>
+                        <a:path w="100000" h="100000">
+                          <a:moveTo>
+                            <a:pt x="0" y="0"/>
+                          </a:moveTo>
+                          <a:lnTo>
+                            <a:pt x="100000" y="0"/>
+                          </a:lnTo>
+                          <a:lnTo>
+                            <a:pt x="100000" y="94500"/>
+                          </a:lnTo>
+                          <a:lnTo>
+                            <a:pt x="44000" y="94500"/>
+                          </a:lnTo>
+                          <a:lnTo>
+                            <a:pt x="44000" y="100000"/>
+                          </a:lnTo>
+                          <a:lnTo>
+                            <a:pt x="0" y="100000"/>
+                          </a:lnTo>
+                          <a:close/>
+                        </a:path>
+                      </a:pathLst>
+                    </a:custGeom>
+                  </pic:spPr>
+                </pic:pic>
+              </a:graphicData>
+            </a:graphic>
+          </wp:anchor>
+        </w:drawing>
+      </w:r>
+    </w:p>
+    <w:p>
+      <w:pPr>
+        <w:ind w:right="1701"/>
+      </w:pPr>
       <w:r>
         <w:rPr>
           <w:b/>
@@ -1322,6 +1709,7 @@
       <w:pPr>
         <w:pageBreakBefore/>
         <w:spacing w:after="60"/>
+        <w:ind w:right="1701"/>
       </w:pPr>
       <w:r>
         <w:rPr>
@@ -1330,8 +1718,83 @@
         </w:rPr>
         <w:t>Blatt 8</w:t>
       </w:r>
-    </w:p>
-    <w:p>
+      <w:r>
+        <w:drawing>
+          <wp:anchor distT="0" distB="0" distL="0" distR="0" simplePos="0" relativeHeight="0" behindDoc="0" locked="0" layoutInCell="1" allowOverlap="0">
+            <wp:simplePos x="0" y="0"/>
+            <wp:positionH relativeFrom="column">
+              <wp:align>right</wp:align>
+            </wp:positionH>
+            <wp:positionV relativeFrom="paragraph">
+              <wp:posOffset>0</wp:posOffset>
+            </wp:positionV>
+            <wp:extent cx="663765" cy="558000"/>
+            <wp:wrapNone/>
+            <wp:docPr id="8" name="Picture 8" descr="Otter liest einen Brief"/>
+            <wp:cNvGraphicFramePr xmlns:a="http://schemas.openxmlformats.org/drawingml/2006/main">
+              <a:graphicFrameLocks noChangeAspect="1"/>
+            </wp:cNvGraphicFramePr>
+            <a:graphic xmlns:a="http://schemas.openxmlformats.org/drawingml/2006/main" xmlns:pic="http://schemas.openxmlformats.org/drawingml/2006/picture">
+              <a:graphicData uri="http://schemas.openxmlformats.org/drawingml/2006/picture">
+                <pic:pic>
+                  <pic:nvPicPr>
+                    <pic:cNvPr id="0" name="Collage Otterbilder Briefe.png"/>
+                    <pic:cNvPicPr/>
+                  </pic:nvPicPr>
+                  <pic:blipFill>
+                    <a:blip r:embed="rId9"/>
+                    <a:srcRect l="5500" t="33500" r="67200" b="35900"/>
+                    <a:stretch>
+                      <a:fillRect/>
+                    </a:stretch>
+                  </pic:blipFill>
+                  <pic:spPr>
+                    <a:xfrm>
+                      <a:off x="0" y="0"/>
+                      <a:ext cx="663765" cy="558000"/>
+                    </a:xfrm>
+                    <a:custGeom>
+                      <a:avLst/>
+                      <a:gdLst/>
+                      <a:ahLst/>
+                      <a:cxnLst/>
+                      <a:rect l="0" t="0" r="r" b="b"/>
+                      <a:pathLst>
+                        <a:path w="100000" h="100000">
+                          <a:moveTo>
+                            <a:pt x="0" y="0"/>
+                          </a:moveTo>
+                          <a:lnTo>
+                            <a:pt x="100000" y="0"/>
+                          </a:lnTo>
+                          <a:lnTo>
+                            <a:pt x="100000" y="94500"/>
+                          </a:lnTo>
+                          <a:lnTo>
+                            <a:pt x="44000" y="94500"/>
+                          </a:lnTo>
+                          <a:lnTo>
+                            <a:pt x="44000" y="100000"/>
+                          </a:lnTo>
+                          <a:lnTo>
+                            <a:pt x="0" y="100000"/>
+                          </a:lnTo>
+                          <a:close/>
+                        </a:path>
+                      </a:pathLst>
+                    </a:custGeom>
+                  </pic:spPr>
+                </pic:pic>
+              </a:graphicData>
+            </a:graphic>
+          </wp:anchor>
+        </w:drawing>
+      </w:r>
+    </w:p>
+    <w:p>
+      <w:pPr>
+        <w:ind w:right="1701"/>
+      </w:pPr>
       <w:r>
         <w:rPr>
           <w:b/>
@@ -1456,6 +1919,7 @@
       <w:pPr>
         <w:pageBreakBefore/>
         <w:spacing w:after="60"/>
+        <w:ind w:right="1701"/>
       </w:pPr>
       <w:r>
         <w:rPr>
@@ -1464,8 +1928,54 @@
         </w:rPr>
         <w:t>Blatt 9</w:t>
       </w:r>
-    </w:p>
-    <w:p>
+      <w:r>
+        <w:drawing>
+          <wp:anchor distT="0" distB="0" distL="0" distR="0" simplePos="0" relativeHeight="0" behindDoc="0" locked="0" layoutInCell="1" allowOverlap="0">
+            <wp:simplePos x="0" y="0"/>
+            <wp:positionH relativeFrom="column">
+              <wp:align>right</wp:align>
+            </wp:positionH>
+            <wp:positionV relativeFrom="paragraph">
+              <wp:posOffset>0</wp:posOffset>
+            </wp:positionV>
+            <wp:extent cx="826667" cy="558000"/>
+            <wp:wrapNone/>
+            <wp:docPr id="9" name="Picture 9" descr="Otter schreibt einen Brief"/>
+            <wp:cNvGraphicFramePr xmlns:a="http://schemas.openxmlformats.org/drawingml/2006/main">
+              <a:graphicFrameLocks noChangeAspect="1"/>
+            </wp:cNvGraphicFramePr>
+            <a:graphic xmlns:a="http://schemas.openxmlformats.org/drawingml/2006/main" xmlns:pic="http://schemas.openxmlformats.org/drawingml/2006/picture">
+              <a:graphicData uri="http://schemas.openxmlformats.org/drawingml/2006/picture">
+                <pic:pic>
+                  <pic:nvPicPr>
+                    <pic:cNvPr id="0" name="Collage Otterbilder Briefe.png"/>
+                    <pic:cNvPicPr/>
+                  </pic:nvPicPr>
+                  <pic:blipFill>
+                    <a:blip r:embed="rId9"/>
+                    <a:srcRect l="34500" t="3700" r="36500" b="70200"/>
+                    <a:stretch>
+                      <a:fillRect/>
+                    </a:stretch>
+                  </pic:blipFill>
+                  <pic:spPr>
+                    <a:xfrm>
+                      <a:off x="0" y="0"/>
+                      <a:ext cx="826667" cy="558000"/>
+                    </a:xfrm>
+                    <a:prstGeom prst="rect"/>
+                  </pic:spPr>
+                </pic:pic>
+              </a:graphicData>
+            </a:graphic>
+          </wp:anchor>
+        </w:drawing>
+      </w:r>
+    </w:p>
+    <w:p>
+      <w:pPr>
+        <w:ind w:right="1701"/>
+      </w:pPr>
       <w:r>
         <w:rPr>
           <w:b/>
@@ -1597,6 +2107,7 @@
       <w:pPr>
         <w:pageBreakBefore/>
         <w:spacing w:after="60"/>
+        <w:ind w:right="1701"/>
       </w:pPr>
       <w:r>
         <w:rPr>
@@ -1605,8 +2116,83 @@
         </w:rPr>
         <w:t>Blatt 10</w:t>
       </w:r>
-    </w:p>
-    <w:p>
+      <w:r>
+        <w:drawing>
+          <wp:anchor distT="0" distB="0" distL="0" distR="0" simplePos="0" relativeHeight="0" behindDoc="0" locked="0" layoutInCell="1" allowOverlap="0">
+            <wp:simplePos x="0" y="0"/>
+            <wp:positionH relativeFrom="column">
+              <wp:align>right</wp:align>
+            </wp:positionH>
+            <wp:positionV relativeFrom="paragraph">
+              <wp:posOffset>0</wp:posOffset>
+            </wp:positionV>
+            <wp:extent cx="663765" cy="558000"/>
+            <wp:wrapNone/>
+            <wp:docPr id="10" name="Picture 10" descr="Otter liest einen Brief"/>
+            <wp:cNvGraphicFramePr xmlns:a="http://schemas.openxmlformats.org/drawingml/2006/main">
+              <a:graphicFrameLocks noChangeAspect="1"/>
+            </wp:cNvGraphicFramePr>
+            <a:graphic xmlns:a="http://schemas.openxmlformats.org/drawingml/2006/main" xmlns:pic="http://schemas.openxmlformats.org/drawingml/2006/picture">
+              <a:graphicData uri="http://schemas.openxmlformats.org/drawingml/2006/picture">
+                <pic:pic>
+                  <pic:nvPicPr>
+                    <pic:cNvPr id="0" name="Collage Otterbilder Briefe.png"/>
+                    <pic:cNvPicPr/>
+                  </pic:nvPicPr>
+                  <pic:blipFill>
+                    <a:blip r:embed="rId9"/>
+                    <a:srcRect l="5500" t="33500" r="67200" b="35900"/>
+                    <a:stretch>
+                      <a:fillRect/>
+                    </a:stretch>
+                  </pic:blipFill>
+                  <pic:spPr>
+                    <a:xfrm>
+                      <a:off x="0" y="0"/>
+                      <a:ext cx="663765" cy="558000"/>
+                    </a:xfrm>
+                    <a:custGeom>
+                      <a:avLst/>
+                      <a:gdLst/>
+                      <a:ahLst/>
+                      <a:cxnLst/>
+                      <a:rect l="0" t="0" r="r" b="b"/>
+                      <a:pathLst>
+                        <a:path w="100000" h="100000">
+                          <a:moveTo>
+                            <a:pt x="0" y="0"/>
+                          </a:moveTo>
+                          <a:lnTo>
+                            <a:pt x="100000" y="0"/>
+                          </a:lnTo>
+                          <a:lnTo>
+                            <a:pt x="100000" y="94500"/>
+                          </a:lnTo>
+                          <a:lnTo>
+                            <a:pt x="44000" y="94500"/>
+                          </a:lnTo>
+                          <a:lnTo>
+                            <a:pt x="44000" y="100000"/>
+                          </a:lnTo>
+                          <a:lnTo>
+                            <a:pt x="0" y="100000"/>
+                          </a:lnTo>
+                          <a:close/>
+                        </a:path>
+                      </a:pathLst>
+                    </a:custGeom>
+                  </pic:spPr>
+                </pic:pic>
+              </a:graphicData>
+            </a:graphic>
+          </wp:anchor>
+        </w:drawing>
+      </w:r>
+    </w:p>
+    <w:p>
+      <w:pPr>
+        <w:ind w:right="1701"/>
+      </w:pPr>
       <w:r>
         <w:rPr>
           <w:b/>
@@ -1735,6 +2321,7 @@
       <w:pPr>
         <w:pageBreakBefore/>
         <w:spacing w:after="60"/>
+        <w:ind w:right="1701"/>
       </w:pPr>
       <w:r>
         <w:rPr>
@@ -1743,8 +2330,54 @@
         </w:rPr>
         <w:t>Blatt 11</w:t>
       </w:r>
-    </w:p>
-    <w:p>
+      <w:r>
+        <w:drawing>
+          <wp:anchor distT="0" distB="0" distL="0" distR="0" simplePos="0" relativeHeight="0" behindDoc="0" locked="0" layoutInCell="1" allowOverlap="0">
+            <wp:simplePos x="0" y="0"/>
+            <wp:positionH relativeFrom="column">
+              <wp:align>right</wp:align>
+            </wp:positionH>
+            <wp:positionV relativeFrom="paragraph">
+              <wp:posOffset>0</wp:posOffset>
+            </wp:positionV>
+            <wp:extent cx="826667" cy="558000"/>
+            <wp:wrapNone/>
+            <wp:docPr id="11" name="Picture 11" descr="Otter schreibt einen Brief"/>
+            <wp:cNvGraphicFramePr xmlns:a="http://schemas.openxmlformats.org/drawingml/2006/main">
+              <a:graphicFrameLocks noChangeAspect="1"/>
+            </wp:cNvGraphicFramePr>
+            <a:graphic xmlns:a="http://schemas.openxmlformats.org/drawingml/2006/main" xmlns:pic="http://schemas.openxmlformats.org/drawingml/2006/picture">
+              <a:graphicData uri="http://schemas.openxmlformats.org/drawingml/2006/picture">
+                <pic:pic>
+                  <pic:nvPicPr>
+                    <pic:cNvPr id="0" name="Collage Otterbilder Briefe.png"/>
+                    <pic:cNvPicPr/>
+                  </pic:nvPicPr>
+                  <pic:blipFill>
+                    <a:blip r:embed="rId9"/>
+                    <a:srcRect l="34500" t="3700" r="36500" b="70200"/>
+                    <a:stretch>
+                      <a:fillRect/>
+                    </a:stretch>
+                  </pic:blipFill>
+                  <pic:spPr>
+                    <a:xfrm>
+                      <a:off x="0" y="0"/>
+                      <a:ext cx="826667" cy="558000"/>
+                    </a:xfrm>
+                    <a:prstGeom prst="rect"/>
+                  </pic:spPr>
+                </pic:pic>
+              </a:graphicData>
+            </a:graphic>
+          </wp:anchor>
+        </w:drawing>
+      </w:r>
+    </w:p>
+    <w:p>
+      <w:pPr>
+        <w:ind w:right="1701"/>
+      </w:pPr>
       <w:r>
         <w:rPr>
           <w:b/>
@@ -1896,6 +2529,7 @@
       <w:pPr>
         <w:pageBreakBefore/>
         <w:spacing w:after="60"/>
+        <w:ind w:right="1701"/>
       </w:pPr>
       <w:r>
         <w:rPr>
@@ -1904,8 +2538,54 @@
         </w:rPr>
         <w:t>Blatt 12</w:t>
       </w:r>
-    </w:p>
-    <w:p>
+      <w:r>
+        <w:drawing>
+          <wp:anchor distT="0" distB="0" distL="0" distR="0" simplePos="0" relativeHeight="0" behindDoc="0" locked="0" layoutInCell="1" allowOverlap="0">
+            <wp:simplePos x="0" y="0"/>
+            <wp:positionH relativeFrom="column">
+              <wp:align>right</wp:align>
+            </wp:positionH>
+            <wp:positionV relativeFrom="paragraph">
+              <wp:posOffset>0</wp:posOffset>
+            </wp:positionV>
+            <wp:extent cx="826667" cy="558000"/>
+            <wp:wrapNone/>
+            <wp:docPr id="12" name="Picture 12" descr="Otter schreibt einen Brief"/>
+            <wp:cNvGraphicFramePr xmlns:a="http://schemas.openxmlformats.org/drawingml/2006/main">
+              <a:graphicFrameLocks noChangeAspect="1"/>
+            </wp:cNvGraphicFramePr>
+            <a:graphic xmlns:a="http://schemas.openxmlformats.org/drawingml/2006/main" xmlns:pic="http://schemas.openxmlformats.org/drawingml/2006/picture">
+              <a:graphicData uri="http://schemas.openxmlformats.org/drawingml/2006/picture">
+                <pic:pic>
+                  <pic:nvPicPr>
+                    <pic:cNvPr id="0" name="Collage Otterbilder Briefe.png"/>
+                    <pic:cNvPicPr/>
+                  </pic:nvPicPr>
+                  <pic:blipFill>
+                    <a:blip r:embed="rId9"/>
+                    <a:srcRect l="34500" t="3700" r="36500" b="70200"/>
+                    <a:stretch>
+                      <a:fillRect/>
+                    </a:stretch>
+                  </pic:blipFill>
+                  <pic:spPr>
+                    <a:xfrm>
+                      <a:off x="0" y="0"/>
+                      <a:ext cx="826667" cy="558000"/>
+                    </a:xfrm>
+                    <a:prstGeom prst="rect"/>
+                  </pic:spPr>
+                </pic:pic>
+              </a:graphicData>
+            </a:graphic>
+          </wp:anchor>
+        </w:drawing>
+      </w:r>
+    </w:p>
+    <w:p>
+      <w:pPr>
+        <w:ind w:right="1701"/>
+      </w:pPr>
       <w:r>
         <w:rPr>
           <w:b/>
@@ -2043,6 +2723,7 @@
       <w:pPr>
         <w:pageBreakBefore/>
         <w:spacing w:after="60"/>
+        <w:ind w:right="1701"/>
       </w:pPr>
       <w:r>
         <w:rPr>
@@ -2051,8 +2732,54 @@
         </w:rPr>
         <w:t>Blatt 13</w:t>
       </w:r>
-    </w:p>
-    <w:p>
+      <w:r>
+        <w:drawing>
+          <wp:anchor distT="0" distB="0" distL="0" distR="0" simplePos="0" relativeHeight="0" behindDoc="0" locked="0" layoutInCell="1" allowOverlap="0">
+            <wp:simplePos x="0" y="0"/>
+            <wp:positionH relativeFrom="column">
+              <wp:align>right</wp:align>
+            </wp:positionH>
+            <wp:positionV relativeFrom="paragraph">
+              <wp:posOffset>0</wp:posOffset>
+            </wp:positionV>
+            <wp:extent cx="594184" cy="558000"/>
+            <wp:wrapNone/>
+            <wp:docPr id="13" name="Picture 13" descr="Otter denkt nach"/>
+            <wp:cNvGraphicFramePr xmlns:a="http://schemas.openxmlformats.org/drawingml/2006/main">
+              <a:graphicFrameLocks noChangeAspect="1"/>
+            </wp:cNvGraphicFramePr>
+            <a:graphic xmlns:a="http://schemas.openxmlformats.org/drawingml/2006/main" xmlns:pic="http://schemas.openxmlformats.org/drawingml/2006/picture">
+              <a:graphicData uri="http://schemas.openxmlformats.org/drawingml/2006/picture">
+                <pic:pic>
+                  <pic:nvPicPr>
+                    <pic:cNvPr id="0" name="Collage Otterbilder Briefe.png"/>
+                    <pic:cNvPicPr/>
+                  </pic:nvPicPr>
+                  <pic:blipFill>
+                    <a:blip r:embed="rId9"/>
+                    <a:srcRect l="36800" t="31000" r="39800" b="39700"/>
+                    <a:stretch>
+                      <a:fillRect/>
+                    </a:stretch>
+                  </pic:blipFill>
+                  <pic:spPr>
+                    <a:xfrm>
+                      <a:off x="0" y="0"/>
+                      <a:ext cx="594184" cy="558000"/>
+                    </a:xfrm>
+                    <a:prstGeom prst="rect"/>
+                  </pic:spPr>
+                </pic:pic>
+              </a:graphicData>
+            </a:graphic>
+          </wp:anchor>
+        </w:drawing>
+      </w:r>
+    </w:p>
+    <w:p>
+      <w:pPr>
+        <w:ind w:right="1701"/>
+      </w:pPr>
       <w:r>
         <w:rPr>
           <w:b/>
@@ -2212,6 +2939,7 @@
       <w:pPr>
         <w:pageBreakBefore/>
         <w:spacing w:after="60"/>
+        <w:ind w:right="1701"/>
       </w:pPr>
       <w:r>
         <w:rPr>
@@ -2220,8 +2948,54 @@
         </w:rPr>
         <w:t>Blatt 14</w:t>
       </w:r>
-    </w:p>
-    <w:p>
+      <w:r>
+        <w:drawing>
+          <wp:anchor distT="0" distB="0" distL="0" distR="0" simplePos="0" relativeHeight="0" behindDoc="0" locked="0" layoutInCell="1" allowOverlap="0">
+            <wp:simplePos x="0" y="0"/>
+            <wp:positionH relativeFrom="column">
+              <wp:align>right</wp:align>
+            </wp:positionH>
+            <wp:positionV relativeFrom="paragraph">
+              <wp:posOffset>0</wp:posOffset>
+            </wp:positionV>
+            <wp:extent cx="594184" cy="558000"/>
+            <wp:wrapNone/>
+            <wp:docPr id="14" name="Picture 14" descr="Otter denkt nach"/>
+            <wp:cNvGraphicFramePr xmlns:a="http://schemas.openxmlformats.org/drawingml/2006/main">
+              <a:graphicFrameLocks noChangeAspect="1"/>
+            </wp:cNvGraphicFramePr>
+            <a:graphic xmlns:a="http://schemas.openxmlformats.org/drawingml/2006/main" xmlns:pic="http://schemas.openxmlformats.org/drawingml/2006/picture">
+              <a:graphicData uri="http://schemas.openxmlformats.org/drawingml/2006/picture">
+                <pic:pic>
+                  <pic:nvPicPr>
+                    <pic:cNvPr id="0" name="Collage Otterbilder Briefe.png"/>
+                    <pic:cNvPicPr/>
+                  </pic:nvPicPr>
+                  <pic:blipFill>
+                    <a:blip r:embed="rId9"/>
+                    <a:srcRect l="36800" t="31000" r="39800" b="39700"/>
+                    <a:stretch>
+                      <a:fillRect/>
+                    </a:stretch>
+                  </pic:blipFill>
+                  <pic:spPr>
+                    <a:xfrm>
+                      <a:off x="0" y="0"/>
+                      <a:ext cx="594184" cy="558000"/>
+                    </a:xfrm>
+                    <a:prstGeom prst="rect"/>
+                  </pic:spPr>
+                </pic:pic>
+              </a:graphicData>
+            </a:graphic>
+          </wp:anchor>
+        </w:drawing>
+      </w:r>
+    </w:p>
+    <w:p>
+      <w:pPr>
+        <w:ind w:right="1701"/>
+      </w:pPr>
       <w:r>
         <w:rPr>
           <w:b/>
@@ -2356,6 +3130,7 @@
       <w:pPr>
         <w:pageBreakBefore/>
         <w:spacing w:after="60"/>
+        <w:ind w:right="1701"/>
       </w:pPr>
       <w:r>
         <w:rPr>
@@ -2364,8 +3139,54 @@
         </w:rPr>
         <w:t>Blatt 15</w:t>
       </w:r>
-    </w:p>
-    <w:p>
+      <w:r>
+        <w:drawing>
+          <wp:anchor distT="0" distB="0" distL="0" distR="0" simplePos="0" relativeHeight="0" behindDoc="0" locked="0" layoutInCell="1" allowOverlap="0">
+            <wp:simplePos x="0" y="0"/>
+            <wp:positionH relativeFrom="column">
+              <wp:align>right</wp:align>
+            </wp:positionH>
+            <wp:positionV relativeFrom="paragraph">
+              <wp:posOffset>0</wp:posOffset>
+            </wp:positionV>
+            <wp:extent cx="594184" cy="558000"/>
+            <wp:wrapNone/>
+            <wp:docPr id="15" name="Picture 15" descr="Otter denkt nach"/>
+            <wp:cNvGraphicFramePr xmlns:a="http://schemas.openxmlformats.org/drawingml/2006/main">
+              <a:graphicFrameLocks noChangeAspect="1"/>
+            </wp:cNvGraphicFramePr>
+            <a:graphic xmlns:a="http://schemas.openxmlformats.org/drawingml/2006/main" xmlns:pic="http://schemas.openxmlformats.org/drawingml/2006/picture">
+              <a:graphicData uri="http://schemas.openxmlformats.org/drawingml/2006/picture">
+                <pic:pic>
+                  <pic:nvPicPr>
+                    <pic:cNvPr id="0" name="Collage Otterbilder Briefe.png"/>
+                    <pic:cNvPicPr/>
+                  </pic:nvPicPr>
+                  <pic:blipFill>
+                    <a:blip r:embed="rId9"/>
+                    <a:srcRect l="36800" t="31000" r="39800" b="39700"/>
+                    <a:stretch>
+                      <a:fillRect/>
+                    </a:stretch>
+                  </pic:blipFill>
+                  <pic:spPr>
+                    <a:xfrm>
+                      <a:off x="0" y="0"/>
+                      <a:ext cx="594184" cy="558000"/>
+                    </a:xfrm>
+                    <a:prstGeom prst="rect"/>
+                  </pic:spPr>
+                </pic:pic>
+              </a:graphicData>
+            </a:graphic>
+          </wp:anchor>
+        </w:drawing>
+      </w:r>
+    </w:p>
+    <w:p>
+      <w:pPr>
+        <w:ind w:right="1701"/>
+      </w:pPr>
       <w:r>
         <w:rPr>
           <w:b/>
@@ -2519,6 +3340,7 @@
       <w:pPr>
         <w:pageBreakBefore/>
         <w:spacing w:after="60"/>
+        <w:ind w:right="1701"/>
       </w:pPr>
       <w:r>
         <w:rPr>
@@ -2527,8 +3349,54 @@
         </w:rPr>
         <w:t>Blatt 16</w:t>
       </w:r>
-    </w:p>
-    <w:p>
+      <w:r>
+        <w:drawing>
+          <wp:anchor distT="0" distB="0" distL="0" distR="0" simplePos="0" relativeHeight="0" behindDoc="0" locked="0" layoutInCell="1" allowOverlap="0">
+            <wp:simplePos x="0" y="0"/>
+            <wp:positionH relativeFrom="column">
+              <wp:align>right</wp:align>
+            </wp:positionH>
+            <wp:positionV relativeFrom="paragraph">
+              <wp:posOffset>0</wp:posOffset>
+            </wp:positionV>
+            <wp:extent cx="594184" cy="558000"/>
+            <wp:wrapNone/>
+            <wp:docPr id="16" name="Picture 16" descr="Otter denkt nach"/>
+            <wp:cNvGraphicFramePr xmlns:a="http://schemas.openxmlformats.org/drawingml/2006/main">
+              <a:graphicFrameLocks noChangeAspect="1"/>
+            </wp:cNvGraphicFramePr>
+            <a:graphic xmlns:a="http://schemas.openxmlformats.org/drawingml/2006/main" xmlns:pic="http://schemas.openxmlformats.org/drawingml/2006/picture">
+              <a:graphicData uri="http://schemas.openxmlformats.org/drawingml/2006/picture">
+                <pic:pic>
+                  <pic:nvPicPr>
+                    <pic:cNvPr id="0" name="Collage Otterbilder Briefe.png"/>
+                    <pic:cNvPicPr/>
+                  </pic:nvPicPr>
+                  <pic:blipFill>
+                    <a:blip r:embed="rId9"/>
+                    <a:srcRect l="36800" t="31000" r="39800" b="39700"/>
+                    <a:stretch>
+                      <a:fillRect/>
+                    </a:stretch>
+                  </pic:blipFill>
+                  <pic:spPr>
+                    <a:xfrm>
+                      <a:off x="0" y="0"/>
+                      <a:ext cx="594184" cy="558000"/>
+                    </a:xfrm>
+                    <a:prstGeom prst="rect"/>
+                  </pic:spPr>
+                </pic:pic>
+              </a:graphicData>
+            </a:graphic>
+          </wp:anchor>
+        </w:drawing>
+      </w:r>
+    </w:p>
+    <w:p>
+      <w:pPr>
+        <w:ind w:right="1701"/>
+      </w:pPr>
       <w:r>
         <w:rPr>
           <w:b/>
@@ -2664,6 +3532,7 @@
       <w:pPr>
         <w:pageBreakBefore/>
         <w:spacing w:after="60"/>
+        <w:ind w:right="1701"/>
       </w:pPr>
       <w:r>
         <w:rPr>
@@ -2672,8 +3541,54 @@
         </w:rPr>
         <w:t>Blatt 17</w:t>
       </w:r>
-    </w:p>
-    <w:p>
+      <w:r>
+        <w:drawing>
+          <wp:anchor distT="0" distB="0" distL="0" distR="0" simplePos="0" relativeHeight="0" behindDoc="0" locked="0" layoutInCell="1" allowOverlap="0">
+            <wp:simplePos x="0" y="0"/>
+            <wp:positionH relativeFrom="column">
+              <wp:align>right</wp:align>
+            </wp:positionH>
+            <wp:positionV relativeFrom="paragraph">
+              <wp:posOffset>0</wp:posOffset>
+            </wp:positionV>
+            <wp:extent cx="826667" cy="558000"/>
+            <wp:wrapNone/>
+            <wp:docPr id="17" name="Picture 17" descr="Otter schreibt einen Brief"/>
+            <wp:cNvGraphicFramePr xmlns:a="http://schemas.openxmlformats.org/drawingml/2006/main">
+              <a:graphicFrameLocks noChangeAspect="1"/>
+            </wp:cNvGraphicFramePr>
+            <a:graphic xmlns:a="http://schemas.openxmlformats.org/drawingml/2006/main" xmlns:pic="http://schemas.openxmlformats.org/drawingml/2006/picture">
+              <a:graphicData uri="http://schemas.openxmlformats.org/drawingml/2006/picture">
+                <pic:pic>
+                  <pic:nvPicPr>
+                    <pic:cNvPr id="0" name="Collage Otterbilder Briefe.png"/>
+                    <pic:cNvPicPr/>
+                  </pic:nvPicPr>
+                  <pic:blipFill>
+                    <a:blip r:embed="rId9"/>
+                    <a:srcRect l="34500" t="3700" r="36500" b="70200"/>
+                    <a:stretch>
+                      <a:fillRect/>
+                    </a:stretch>
+                  </pic:blipFill>
+                  <pic:spPr>
+                    <a:xfrm>
+                      <a:off x="0" y="0"/>
+                      <a:ext cx="826667" cy="558000"/>
+                    </a:xfrm>
+                    <a:prstGeom prst="rect"/>
+                  </pic:spPr>
+                </pic:pic>
+              </a:graphicData>
+            </a:graphic>
+          </wp:anchor>
+        </w:drawing>
+      </w:r>
+    </w:p>
+    <w:p>
+      <w:pPr>
+        <w:ind w:right="1701"/>
+      </w:pPr>
       <w:r>
         <w:rPr>
           <w:b/>
@@ -2830,6 +3745,7 @@
       <w:pPr>
         <w:pageBreakBefore/>
         <w:spacing w:after="60"/>
+        <w:ind w:right="1701"/>
       </w:pPr>
       <w:r>
         <w:rPr>
@@ -2838,8 +3754,54 @@
         </w:rPr>
         <w:t>Blatt 18</w:t>
       </w:r>
-    </w:p>
-    <w:p>
+      <w:r>
+        <w:drawing>
+          <wp:anchor distT="0" distB="0" distL="0" distR="0" simplePos="0" relativeHeight="0" behindDoc="0" locked="0" layoutInCell="1" allowOverlap="0">
+            <wp:simplePos x="0" y="0"/>
+            <wp:positionH relativeFrom="column">
+              <wp:align>right</wp:align>
+            </wp:positionH>
+            <wp:positionV relativeFrom="paragraph">
+              <wp:posOffset>0</wp:posOffset>
+            </wp:positionV>
+            <wp:extent cx="826667" cy="558000"/>
+            <wp:wrapNone/>
+            <wp:docPr id="18" name="Picture 18" descr="Otter schreibt einen Brief"/>
+            <wp:cNvGraphicFramePr xmlns:a="http://schemas.openxmlformats.org/drawingml/2006/main">
+              <a:graphicFrameLocks noChangeAspect="1"/>
+            </wp:cNvGraphicFramePr>
+            <a:graphic xmlns:a="http://schemas.openxmlformats.org/drawingml/2006/main" xmlns:pic="http://schemas.openxmlformats.org/drawingml/2006/picture">
+              <a:graphicData uri="http://schemas.openxmlformats.org/drawingml/2006/picture">
+                <pic:pic>
+                  <pic:nvPicPr>
+                    <pic:cNvPr id="0" name="Collage Otterbilder Briefe.png"/>
+                    <pic:cNvPicPr/>
+                  </pic:nvPicPr>
+                  <pic:blipFill>
+                    <a:blip r:embed="rId9"/>
+                    <a:srcRect l="34500" t="3700" r="36500" b="70200"/>
+                    <a:stretch>
+                      <a:fillRect/>
+                    </a:stretch>
+                  </pic:blipFill>
+                  <pic:spPr>
+                    <a:xfrm>
+                      <a:off x="0" y="0"/>
+                      <a:ext cx="826667" cy="558000"/>
+                    </a:xfrm>
+                    <a:prstGeom prst="rect"/>
+                  </pic:spPr>
+                </pic:pic>
+              </a:graphicData>
+            </a:graphic>
+          </wp:anchor>
+        </w:drawing>
+      </w:r>
+    </w:p>
+    <w:p>
+      <w:pPr>
+        <w:ind w:right="1701"/>
+      </w:pPr>
       <w:r>
         <w:rPr>
           <w:b/>
@@ -2983,6 +3945,7 @@
       <w:pPr>
         <w:pageBreakBefore/>
         <w:spacing w:after="60"/>
+        <w:ind w:right="1701"/>
       </w:pPr>
       <w:r>
         <w:rPr>
@@ -2991,8 +3954,83 @@
         </w:rPr>
         <w:t>Blatt 19</w:t>
       </w:r>
-    </w:p>
-    <w:p>
+      <w:r>
+        <w:drawing>
+          <wp:anchor distT="0" distB="0" distL="0" distR="0" simplePos="0" relativeHeight="0" behindDoc="0" locked="0" layoutInCell="1" allowOverlap="0">
+            <wp:simplePos x="0" y="0"/>
+            <wp:positionH relativeFrom="column">
+              <wp:align>right</wp:align>
+            </wp:positionH>
+            <wp:positionV relativeFrom="paragraph">
+              <wp:posOffset>0</wp:posOffset>
+            </wp:positionV>
+            <wp:extent cx="663765" cy="558000"/>
+            <wp:wrapNone/>
+            <wp:docPr id="19" name="Picture 19" descr="Otter liest einen Brief"/>
+            <wp:cNvGraphicFramePr xmlns:a="http://schemas.openxmlformats.org/drawingml/2006/main">
+              <a:graphicFrameLocks noChangeAspect="1"/>
+            </wp:cNvGraphicFramePr>
+            <a:graphic xmlns:a="http://schemas.openxmlformats.org/drawingml/2006/main" xmlns:pic="http://schemas.openxmlformats.org/drawingml/2006/picture">
+              <a:graphicData uri="http://schemas.openxmlformats.org/drawingml/2006/picture">
+                <pic:pic>
+                  <pic:nvPicPr>
+                    <pic:cNvPr id="0" name="Collage Otterbilder Briefe.png"/>
+                    <pic:cNvPicPr/>
+                  </pic:nvPicPr>
+                  <pic:blipFill>
+                    <a:blip r:embed="rId9"/>
+                    <a:srcRect l="5500" t="33500" r="67200" b="35900"/>
+                    <a:stretch>
+                      <a:fillRect/>
+                    </a:stretch>
+                  </pic:blipFill>
+                  <pic:spPr>
+                    <a:xfrm>
+                      <a:off x="0" y="0"/>
+                      <a:ext cx="663765" cy="558000"/>
+                    </a:xfrm>
+                    <a:custGeom>
+                      <a:avLst/>
+                      <a:gdLst/>
+                      <a:ahLst/>
+                      <a:cxnLst/>
+                      <a:rect l="0" t="0" r="r" b="b"/>
+                      <a:pathLst>
+                        <a:path w="100000" h="100000">
+                          <a:moveTo>
+                            <a:pt x="0" y="0"/>
+                          </a:moveTo>
+                          <a:lnTo>
+                            <a:pt x="100000" y="0"/>
+                          </a:lnTo>
+                          <a:lnTo>
+                            <a:pt x="100000" y="94500"/>
+                          </a:lnTo>
+                          <a:lnTo>
+                            <a:pt x="44000" y="94500"/>
+                          </a:lnTo>
+                          <a:lnTo>
+                            <a:pt x="44000" y="100000"/>
+                          </a:lnTo>
+                          <a:lnTo>
+                            <a:pt x="0" y="100000"/>
+                          </a:lnTo>
+                          <a:close/>
+                        </a:path>
+                      </a:pathLst>
+                    </a:custGeom>
+                  </pic:spPr>
+                </pic:pic>
+              </a:graphicData>
+            </a:graphic>
+          </wp:anchor>
+        </w:drawing>
+      </w:r>
+    </w:p>
+    <w:p>
+      <w:pPr>
+        <w:ind w:right="1701"/>
+      </w:pPr>
       <w:r>
         <w:rPr>
           <w:b/>
@@ -3168,6 +4206,7 @@
       <w:pPr>
         <w:pageBreakBefore/>
         <w:spacing w:after="60"/>
+        <w:ind w:right="1701"/>
       </w:pPr>
       <w:r>
         <w:rPr>
@@ -3176,8 +4215,54 @@
         </w:rPr>
         <w:t>Blatt 20</w:t>
       </w:r>
-    </w:p>
-    <w:p>
+      <w:r>
+        <w:drawing>
+          <wp:anchor distT="0" distB="0" distL="0" distR="0" simplePos="0" relativeHeight="0" behindDoc="0" locked="0" layoutInCell="1" allowOverlap="0">
+            <wp:simplePos x="0" y="0"/>
+            <wp:positionH relativeFrom="column">
+              <wp:align>right</wp:align>
+            </wp:positionH>
+            <wp:positionV relativeFrom="paragraph">
+              <wp:posOffset>0</wp:posOffset>
+            </wp:positionV>
+            <wp:extent cx="826667" cy="558000"/>
+            <wp:wrapNone/>
+            <wp:docPr id="20" name="Picture 20" descr="Otter schreibt einen Brief"/>
+            <wp:cNvGraphicFramePr xmlns:a="http://schemas.openxmlformats.org/drawingml/2006/main">
+              <a:graphicFrameLocks noChangeAspect="1"/>
+            </wp:cNvGraphicFramePr>
+            <a:graphic xmlns:a="http://schemas.openxmlformats.org/drawingml/2006/main" xmlns:pic="http://schemas.openxmlformats.org/drawingml/2006/picture">
+              <a:graphicData uri="http://schemas.openxmlformats.org/drawingml/2006/picture">
+                <pic:pic>
+                  <pic:nvPicPr>
+                    <pic:cNvPr id="0" name="Collage Otterbilder Briefe.png"/>
+                    <pic:cNvPicPr/>
+                  </pic:nvPicPr>
+                  <pic:blipFill>
+                    <a:blip r:embed="rId9"/>
+                    <a:srcRect l="34500" t="3700" r="36500" b="70200"/>
+                    <a:stretch>
+                      <a:fillRect/>
+                    </a:stretch>
+                  </pic:blipFill>
+                  <pic:spPr>
+                    <a:xfrm>
+                      <a:off x="0" y="0"/>
+                      <a:ext cx="826667" cy="558000"/>
+                    </a:xfrm>
+                    <a:prstGeom prst="rect"/>
+                  </pic:spPr>
+                </pic:pic>
+              </a:graphicData>
+            </a:graphic>
+          </wp:anchor>
+        </w:drawing>
+      </w:r>
+    </w:p>
+    <w:p>
+      <w:pPr>
+        <w:ind w:right="1701"/>
+      </w:pPr>
       <w:r>
         <w:rPr>
           <w:b/>
@@ -3321,6 +4406,7 @@
       <w:pPr>
         <w:pageBreakBefore/>
         <w:spacing w:after="60"/>
+        <w:ind w:right="1701"/>
       </w:pPr>
       <w:r>
         <w:rPr>
@@ -3329,8 +4415,54 @@
         </w:rPr>
         <w:t>Blatt 21</w:t>
       </w:r>
-    </w:p>
-    <w:p>
+      <w:r>
+        <w:drawing>
+          <wp:anchor distT="0" distB="0" distL="0" distR="0" simplePos="0" relativeHeight="0" behindDoc="0" locked="0" layoutInCell="1" allowOverlap="0">
+            <wp:simplePos x="0" y="0"/>
+            <wp:positionH relativeFrom="column">
+              <wp:align>right</wp:align>
+            </wp:positionH>
+            <wp:positionV relativeFrom="paragraph">
+              <wp:posOffset>0</wp:posOffset>
+            </wp:positionV>
+            <wp:extent cx="826667" cy="558000"/>
+            <wp:wrapNone/>
+            <wp:docPr id="21" name="Picture 21" descr="Otter schreibt einen Brief"/>
+            <wp:cNvGraphicFramePr xmlns:a="http://schemas.openxmlformats.org/drawingml/2006/main">
+              <a:graphicFrameLocks noChangeAspect="1"/>
+            </wp:cNvGraphicFramePr>
+            <a:graphic xmlns:a="http://schemas.openxmlformats.org/drawingml/2006/main" xmlns:pic="http://schemas.openxmlformats.org/drawingml/2006/picture">
+              <a:graphicData uri="http://schemas.openxmlformats.org/drawingml/2006/picture">
+                <pic:pic>
+                  <pic:nvPicPr>
+                    <pic:cNvPr id="0" name="Collage Otterbilder Briefe.png"/>
+                    <pic:cNvPicPr/>
+                  </pic:nvPicPr>
+                  <pic:blipFill>
+                    <a:blip r:embed="rId9"/>
+                    <a:srcRect l="34500" t="3700" r="36500" b="70200"/>
+                    <a:stretch>
+                      <a:fillRect/>
+                    </a:stretch>
+                  </pic:blipFill>
+                  <pic:spPr>
+                    <a:xfrm>
+                      <a:off x="0" y="0"/>
+                      <a:ext cx="826667" cy="558000"/>
+                    </a:xfrm>
+                    <a:prstGeom prst="rect"/>
+                  </pic:spPr>
+                </pic:pic>
+              </a:graphicData>
+            </a:graphic>
+          </wp:anchor>
+        </w:drawing>
+      </w:r>
+    </w:p>
+    <w:p>
+      <w:pPr>
+        <w:ind w:right="1701"/>
+      </w:pPr>
       <w:r>
         <w:rPr>
           <w:b/>
@@ -3463,6 +4595,7 @@
       <w:pPr>
         <w:pageBreakBefore/>
         <w:spacing w:after="60"/>
+        <w:ind w:right="1701"/>
       </w:pPr>
       <w:r>
         <w:rPr>
@@ -3471,8 +4604,54 @@
         </w:rPr>
         <w:t>Blatt 22</w:t>
       </w:r>
-    </w:p>
-    <w:p>
+      <w:r>
+        <w:drawing>
+          <wp:anchor distT="0" distB="0" distL="0" distR="0" simplePos="0" relativeHeight="0" behindDoc="0" locked="0" layoutInCell="1" allowOverlap="0">
+            <wp:simplePos x="0" y="0"/>
+            <wp:positionH relativeFrom="column">
+              <wp:align>right</wp:align>
+            </wp:positionH>
+            <wp:positionV relativeFrom="paragraph">
+              <wp:posOffset>0</wp:posOffset>
+            </wp:positionV>
+            <wp:extent cx="640850" cy="558000"/>
+            <wp:wrapNone/>
+            <wp:docPr id="22" name="Picture 22" descr="Otter zeigt einen fertigen Brief"/>
+            <wp:cNvGraphicFramePr xmlns:a="http://schemas.openxmlformats.org/drawingml/2006/main">
+              <a:graphicFrameLocks noChangeAspect="1"/>
+            </wp:cNvGraphicFramePr>
+            <a:graphic xmlns:a="http://schemas.openxmlformats.org/drawingml/2006/main" xmlns:pic="http://schemas.openxmlformats.org/drawingml/2006/picture">
+              <a:graphicData uri="http://schemas.openxmlformats.org/drawingml/2006/picture">
+                <pic:pic>
+                  <pic:nvPicPr>
+                    <pic:cNvPr id="0" name="Collage Otterbilder Briefe.png"/>
+                    <pic:cNvPicPr/>
+                  </pic:nvPicPr>
+                  <pic:blipFill>
+                    <a:blip r:embed="rId9"/>
+                    <a:srcRect l="65400" t="61100" r="5400" b="5000"/>
+                    <a:stretch>
+                      <a:fillRect/>
+                    </a:stretch>
+                  </pic:blipFill>
+                  <pic:spPr>
+                    <a:xfrm>
+                      <a:off x="0" y="0"/>
+                      <a:ext cx="640850" cy="558000"/>
+                    </a:xfrm>
+                    <a:prstGeom prst="rect"/>
+                  </pic:spPr>
+                </pic:pic>
+              </a:graphicData>
+            </a:graphic>
+          </wp:anchor>
+        </w:drawing>
+      </w:r>
+    </w:p>
+    <w:p>
+      <w:pPr>
+        <w:ind w:right="1701"/>
+      </w:pPr>
       <w:r>
         <w:rPr>
           <w:b/>
@@ -3632,6 +4811,7 @@
       <w:pPr>
         <w:pageBreakBefore/>
         <w:spacing w:after="60"/>
+        <w:ind w:right="1701"/>
       </w:pPr>
       <w:r>
         <w:rPr>
@@ -3640,8 +4820,54 @@
         </w:rPr>
         <w:t>Blatt 23</w:t>
       </w:r>
-    </w:p>
-    <w:p>
+      <w:r>
+        <w:drawing>
+          <wp:anchor distT="0" distB="0" distL="0" distR="0" simplePos="0" relativeHeight="0" behindDoc="0" locked="0" layoutInCell="1" allowOverlap="0">
+            <wp:simplePos x="0" y="0"/>
+            <wp:positionH relativeFrom="column">
+              <wp:align>right</wp:align>
+            </wp:positionH>
+            <wp:positionV relativeFrom="paragraph">
+              <wp:posOffset>0</wp:posOffset>
+            </wp:positionV>
+            <wp:extent cx="594184" cy="558000"/>
+            <wp:wrapNone/>
+            <wp:docPr id="23" name="Picture 23" descr="Otter denkt nach"/>
+            <wp:cNvGraphicFramePr xmlns:a="http://schemas.openxmlformats.org/drawingml/2006/main">
+              <a:graphicFrameLocks noChangeAspect="1"/>
+            </wp:cNvGraphicFramePr>
+            <a:graphic xmlns:a="http://schemas.openxmlformats.org/drawingml/2006/main" xmlns:pic="http://schemas.openxmlformats.org/drawingml/2006/picture">
+              <a:graphicData uri="http://schemas.openxmlformats.org/drawingml/2006/picture">
+                <pic:pic>
+                  <pic:nvPicPr>
+                    <pic:cNvPr id="0" name="Collage Otterbilder Briefe.png"/>
+                    <pic:cNvPicPr/>
+                  </pic:nvPicPr>
+                  <pic:blipFill>
+                    <a:blip r:embed="rId9"/>
+                    <a:srcRect l="36800" t="31000" r="39800" b="39700"/>
+                    <a:stretch>
+                      <a:fillRect/>
+                    </a:stretch>
+                  </pic:blipFill>
+                  <pic:spPr>
+                    <a:xfrm>
+                      <a:off x="0" y="0"/>
+                      <a:ext cx="594184" cy="558000"/>
+                    </a:xfrm>
+                    <a:prstGeom prst="rect"/>
+                  </pic:spPr>
+                </pic:pic>
+              </a:graphicData>
+            </a:graphic>
+          </wp:anchor>
+        </w:drawing>
+      </w:r>
+    </w:p>
+    <w:p>
+      <w:pPr>
+        <w:ind w:right="1701"/>
+      </w:pPr>
       <w:r>
         <w:rPr>
           <w:b/>
@@ -4004,6 +5230,7 @@
       <w:pPr>
         <w:pageBreakBefore/>
         <w:spacing w:after="60"/>
+        <w:ind w:right="1701"/>
       </w:pPr>
       <w:r>
         <w:rPr>
@@ -4012,8 +5239,54 @@
         </w:rPr>
         <w:t>Blatt 24</w:t>
       </w:r>
-    </w:p>
-    <w:p>
+      <w:r>
+        <w:drawing>
+          <wp:anchor distT="0" distB="0" distL="0" distR="0" simplePos="0" relativeHeight="0" behindDoc="0" locked="0" layoutInCell="1" allowOverlap="0">
+            <wp:simplePos x="0" y="0"/>
+            <wp:positionH relativeFrom="column">
+              <wp:align>right</wp:align>
+            </wp:positionH>
+            <wp:positionV relativeFrom="paragraph">
+              <wp:posOffset>0</wp:posOffset>
+            </wp:positionV>
+            <wp:extent cx="640850" cy="558000"/>
+            <wp:wrapNone/>
+            <wp:docPr id="24" name="Picture 24" descr="Otter zeigt einen fertigen Brief"/>
+            <wp:cNvGraphicFramePr xmlns:a="http://schemas.openxmlformats.org/drawingml/2006/main">
+              <a:graphicFrameLocks noChangeAspect="1"/>
+            </wp:cNvGraphicFramePr>
+            <a:graphic xmlns:a="http://schemas.openxmlformats.org/drawingml/2006/main" xmlns:pic="http://schemas.openxmlformats.org/drawingml/2006/picture">
+              <a:graphicData uri="http://schemas.openxmlformats.org/drawingml/2006/picture">
+                <pic:pic>
+                  <pic:nvPicPr>
+                    <pic:cNvPr id="0" name="Collage Otterbilder Briefe.png"/>
+                    <pic:cNvPicPr/>
+                  </pic:nvPicPr>
+                  <pic:blipFill>
+                    <a:blip r:embed="rId9"/>
+                    <a:srcRect l="65400" t="61100" r="5400" b="5000"/>
+                    <a:stretch>
+                      <a:fillRect/>
+                    </a:stretch>
+                  </pic:blipFill>
+                  <pic:spPr>
+                    <a:xfrm>
+                      <a:off x="0" y="0"/>
+                      <a:ext cx="640850" cy="558000"/>
+                    </a:xfrm>
+                    <a:prstGeom prst="rect"/>
+                  </pic:spPr>
+                </pic:pic>
+              </a:graphicData>
+            </a:graphic>
+          </wp:anchor>
+        </w:drawing>
+      </w:r>
+    </w:p>
+    <w:p>
+      <w:pPr>
+        <w:ind w:right="1701"/>
+      </w:pPr>
       <w:r>
         <w:rPr>
           <w:b/>

</xml_diff>